<commit_message>
feat: add APCRDA Enterprise Database Development & Optimization project and resume updates
</commit_message>
<xml_diff>
--- a/Kotagiri_Kiran_Teja_Resume.docx
+++ b/Kotagiri_Kiran_Teja_Resume.docx
@@ -804,6 +804,28 @@
           <w:i w:val="0"/>
           <w:color w:val="0F2C59"/>
         </w:rPr>
+        <w:t xml:space="preserve">APCRDA Database Development &amp; Production Optimization: </w:t>
+      </w:r>
+      <w:r>
+        <w:rPr>
+          <w:b w:val="0"/>
+          <w:i w:val="0"/>
+          <w:color w:val="1F2937"/>
+        </w:rPr>
+        <w:t>Developed and maintained SQL Server 2019 database objects (tables, stored procedures, views) supporting APCRDA Land Pooling Scheme (LPS), farmer lottery allocation, pension processing, and annuity workflows. Leveraged execution plans, DMVs, and indexing to eliminate bottlenecks, automated recurring jobs via SQL Server Agent, and ensured strict data integrity and zero-data-loss backup management.</w:t>
+      </w:r>
+    </w:p>
+    <w:p>
+      <w:pPr>
+        <w:pStyle w:val="ListBullet"/>
+        <w:spacing w:before="20" w:after="40" w:line="276" w:lineRule="auto"/>
+      </w:pPr>
+      <w:r>
+        <w:rPr>
+          <w:b/>
+          <w:i w:val="0"/>
+          <w:color w:val="0F2C59"/>
+        </w:rPr>
         <w:t xml:space="preserve">Proactive Performance Tuning &amp; Automation: </w:t>
       </w:r>
       <w:r>
@@ -1247,7 +1269,153 @@
           <w:color w:val="0F2C59"/>
           <w:sz w:val="20"/>
         </w:rPr>
-        <w:t>3. AP Nirman — Materials Procurement &amp; CFMS Integration</w:t>
+        <w:t>3. APCRDA Enterprise Database Development &amp; Production Optimization</w:t>
+      </w:r>
+      <w:r>
+        <w:rPr>
+          <w:b/>
+          <w:color w:val="B45309"/>
+          <w:sz w:val="17"/>
+        </w:rPr>
+        <w:t xml:space="preserve">  [Government of Andhra Pradesh • Database Engineering Project (March 2025 – Present)]</w:t>
+      </w:r>
+    </w:p>
+    <w:p>
+      <w:pPr>
+        <w:keepNext/>
+        <w:spacing w:before="0" w:after="60"/>
+      </w:pPr>
+      <w:r>
+        <w:rPr>
+          <w:i/>
+          <w:color w:val="4B5563"/>
+          <w:sz w:val="17"/>
+        </w:rPr>
+        <w:t>Technologies: Microsoft SQL Server 2019, T-SQL, Stored Procedures, Views, Query Optimization, SQL Server Agent, DMVs, Execution Plans, Indexing, Database Backup &amp; Recovery</w:t>
+      </w:r>
+    </w:p>
+    <w:p>
+      <w:pPr>
+        <w:pStyle w:val="ListBullet"/>
+        <w:spacing w:before="20" w:after="40" w:line="276" w:lineRule="auto"/>
+      </w:pPr>
+      <w:r>
+        <w:rPr>
+          <w:b/>
+          <w:i w:val="0"/>
+          <w:color w:val="1F2937"/>
+        </w:rPr>
+        <w:t xml:space="preserve">Database Design &amp; Development: </w:t>
+      </w:r>
+      <w:r>
+        <w:rPr>
+          <w:b w:val="0"/>
+          <w:i w:val="0"/>
+          <w:color w:val="1F2937"/>
+        </w:rPr>
+        <w:t>Developed and maintained SQL Server database objects, including tables, complex queries, stored procedures, and views to support government business applications and operational reporting.</w:t>
+      </w:r>
+    </w:p>
+    <w:p>
+      <w:pPr>
+        <w:pStyle w:val="ListBullet"/>
+        <w:spacing w:before="20" w:after="40" w:line="276" w:lineRule="auto"/>
+      </w:pPr>
+      <w:r>
+        <w:rPr>
+          <w:b/>
+          <w:i w:val="0"/>
+          <w:color w:val="1F2937"/>
+        </w:rPr>
+        <w:t xml:space="preserve">Business Logic Implementation: </w:t>
+      </w:r>
+      <w:r>
+        <w:rPr>
+          <w:b w:val="0"/>
+          <w:i w:val="0"/>
+          <w:color w:val="1F2937"/>
+        </w:rPr>
+        <w:t>Implemented and modified T-SQL logic for Land Pooling Scheme (LPS), farmer lottery allocation, pension processing, and annuity-related data workflows based on business requirements.</w:t>
+      </w:r>
+    </w:p>
+    <w:p>
+      <w:pPr>
+        <w:pStyle w:val="ListBullet"/>
+        <w:spacing w:before="20" w:after="40" w:line="276" w:lineRule="auto"/>
+      </w:pPr>
+      <w:r>
+        <w:rPr>
+          <w:b/>
+          <w:i w:val="0"/>
+          <w:color w:val="1F2937"/>
+        </w:rPr>
+        <w:t xml:space="preserve">Query Performance Optimization &amp; Tuning: </w:t>
+      </w:r>
+      <w:r>
+        <w:rPr>
+          <w:b w:val="0"/>
+          <w:i w:val="0"/>
+          <w:color w:val="1F2937"/>
+        </w:rPr>
+        <w:t>Analyzed graphical execution plans, reviewed indexing strategies, and used Dynamic Management Views (DMVs) to investigate slow-running queries and optimize database performance.</w:t>
+      </w:r>
+    </w:p>
+    <w:p>
+      <w:pPr>
+        <w:pStyle w:val="ListBullet"/>
+        <w:spacing w:before="20" w:after="40" w:line="276" w:lineRule="auto"/>
+      </w:pPr>
+      <w:r>
+        <w:rPr>
+          <w:b/>
+          <w:i w:val="0"/>
+          <w:color w:val="1F2937"/>
+        </w:rPr>
+        <w:t xml:space="preserve">Production Administration &amp; Automated Operations: </w:t>
+      </w:r>
+      <w:r>
+        <w:rPr>
+          <w:b w:val="0"/>
+          <w:i w:val="0"/>
+          <w:color w:val="1F2937"/>
+        </w:rPr>
+        <w:t>Managed database maintenance activities, backup monitoring, storage allocation, and transaction log troubleshooting. Scheduled and monitored SQL Server Agent jobs for recurring backups and administrative routines, improving operational reliability.</w:t>
+      </w:r>
+    </w:p>
+    <w:p>
+      <w:pPr>
+        <w:pStyle w:val="ListBullet"/>
+        <w:spacing w:before="20" w:after="100" w:line="276" w:lineRule="auto"/>
+      </w:pPr>
+      <w:r>
+        <w:rPr>
+          <w:b/>
+          <w:i w:val="0"/>
+          <w:color w:val="1F2937"/>
+        </w:rPr>
+        <w:t xml:space="preserve">Data Validation, Integrity &amp; Reporting: </w:t>
+      </w:r>
+      <w:r>
+        <w:rPr>
+          <w:b w:val="0"/>
+          <w:i w:val="0"/>
+          <w:color w:val="1F2937"/>
+        </w:rPr>
+        <w:t>Performed data verification, cross-table validation, and controlled modifications across critical records. Developed and optimized SQL queries and views supporting lottery allocation, farmer records, and executive pension reporting.</w:t>
+      </w:r>
+    </w:p>
+    <w:p>
+      <w:pPr>
+        <w:keepNext/>
+        <w:spacing w:before="80" w:after="20"/>
+      </w:pPr>
+      <w:r>
+        <w:rPr>
+          <w:b/>
+          <w:color w:val="0F2C59"/>
+          <w:sz w:val="20"/>
+        </w:rPr>
+        <w:t>4. AP Nirman — Materials Procurement &amp; CFMS Integration</w:t>
       </w:r>
       <w:r>
         <w:rPr>
@@ -1305,7 +1473,7 @@
           <w:color w:val="0F2C59"/>
           <w:sz w:val="20"/>
         </w:rPr>
-        <w:t>4. BLIL Corporate Financial &amp; Executive BI Intelligence Suite</w:t>
+        <w:t>5. BLIL Corporate Financial &amp; Executive BI Intelligence Suite</w:t>
       </w:r>
     </w:p>
     <w:p>
@@ -1355,7 +1523,7 @@
           <w:color w:val="0F2C59"/>
           <w:sz w:val="20"/>
         </w:rPr>
-        <w:t>5. Production High Availability &amp; Disaster Recovery Automation Suite</w:t>
+        <w:t>6. Production High Availability &amp; Disaster Recovery Automation Suite</w:t>
       </w:r>
     </w:p>
     <w:p>

</xml_diff>